<commit_message>
feat: redesign the resume with six metric tiles and honest CPaaS/cursivo copy
Rebuilds /cv and /ru/cv to the 24 Aug 2026 spec: six machine-readable metric
tiles (share of group revenue leads, sales headcount growth moved into its
GTM bullet), a positive "What I am looking for" section replacing the old
anti-fit list, CPaaS experience, and one metric line per product card with
a working link to the public Zvonobot AI landing page.

A follow-up multi-persona HR review (RU/international recruiter, ATS/LLM
screener, hiring CPO) then tightened wording across both locales: a leaner
header with no duplicate contact channels, honest "in development" status
for cursivo instead of implying live users, deduplicated headline numbers,
parseable dates, and machine-layer fixes (canonical/hreflang slashes,
Person alumniOf, Telegram spelled out in the printed PDF).
</commit_message>
<xml_diff>
--- a/public/cv/Mikhail_Semenov_CV_EN.docx
+++ b/public/cv/Mikhail_Semenov_CV_EN.docx
@@ -40,7 +40,7 @@
           <w:sz w:val="19"/>
           <w:szCs w:val="19"/>
         </w:rPr>
-        <w:t xml:space="preserve">Perm, Russia (GMT+5) · Remote · Open to relocation (Cyprus, EU, UAE) · Available for business travel · Telegram @Michael_Semenov · perk77331@gmail.com · rebsem.ru · linkedin.com/in/mikhail-semenovv · github.com/RebSem</w:t>
+        <w:t xml:space="preserve">Perm, Russia (GMT+5) · Remote · Open to relocation (Cyprus, EU, UAE) · Telegram @Michael_Semenov · perk77331@gmail.com · rebsem.ru · linkedin.com/in/mikhail-semenovv · github.com/RebSem</w:t>
       </w:r>
     </w:p>
     <w:p>
@@ -67,7 +67,7 @@
           <w:sz w:val="21"/>
           <w:szCs w:val="21"/>
         </w:rPr>
-        <w:t xml:space="preserve">Product manager with an engineering background, 4.5 years in product. Launched Zvonobot AI, a B2B voice AI agent line, from zero to 80 paying business customers and 500,000+ minutes of live conversations in production in under a year. Lead the product team of 4 engineers, set quarterly goals for the line, own pricing, unit economics and go-to-market. Prototype with AI coding agents in days. Open to full-time or contract work; can start within 2-4 weeks.</w:t>
+        <w:t xml:space="preserve">Product manager with an engineering background, 4.5 years in B2B SaaS. Launched a voice AI agent line from zero to 80 paying customers, 500,000+ minutes in production and ~10% of group revenue in under a year. Currently lead a product team of 4 engineers, own pricing, unit economics and new line launches.</w:t>
       </w:r>
     </w:p>
     <w:p>
@@ -99,58 +99,92 @@
           <w:sz w:val="21"/>
           <w:szCs w:val="21"/>
         </w:rPr>
-        <w:t xml:space="preserve">80 paying B2B customers: repeat payments account for 30% of the line revenue.</w:t>
-      </w:r>
-    </w:p>
-    <w:p>
-      <w:pPr>
-        <w:pStyle w:val="ListParagraph"/>
-        <w:numPr>
-          <w:ilvl w:val="0"/>
-          <w:numId w:val="1"/>
-        </w:numPr>
-        <w:spacing w:after="60"/>
-      </w:pPr>
-      <w:r>
-        <w:rPr>
-          <w:sz w:val="21"/>
-          <w:szCs w:val="21"/>
-        </w:rPr>
-        <w:t xml:space="preserve">500,000+ minutes of conversation: handled by the voice AI agents in production.</w:t>
-      </w:r>
-    </w:p>
-    <w:p>
-      <w:pPr>
-        <w:pStyle w:val="ListParagraph"/>
-        <w:numPr>
-          <w:ilvl w:val="0"/>
-          <w:numId w:val="1"/>
-        </w:numPr>
-        <w:spacing w:after="60"/>
-      </w:pPr>
-      <w:r>
-        <w:rPr>
-          <w:sz w:val="21"/>
-          <w:szCs w:val="21"/>
-        </w:rPr>
-        <w:t xml:space="preserve">4 → 15 people on the sales team: grew to sell the line in under a year.</w:t>
-      </w:r>
-    </w:p>
-    <w:p>
-      <w:pPr>
-        <w:pStyle w:val="ListParagraph"/>
-        <w:numPr>
-          <w:ilvl w:val="0"/>
-          <w:numId w:val="1"/>
-        </w:numPr>
-        <w:spacing w:after="60"/>
-      </w:pPr>
-      <w:r>
-        <w:rPr>
-          <w:sz w:val="21"/>
-          <w:szCs w:val="21"/>
-        </w:rPr>
-        <w:t xml:space="preserve">+30% average customer spend: growth in average spend after the AI plans launched.</w:t>
+        <w:t xml:space="preserve">~10% of group revenue comes from a line launched from zero in a year</w:t>
+      </w:r>
+    </w:p>
+    <w:p>
+      <w:pPr>
+        <w:pStyle w:val="ListParagraph"/>
+        <w:numPr>
+          <w:ilvl w:val="0"/>
+          <w:numId w:val="1"/>
+        </w:numPr>
+        <w:spacing w:after="60"/>
+      </w:pPr>
+      <w:r>
+        <w:rPr>
+          <w:sz w:val="21"/>
+          <w:szCs w:val="21"/>
+        </w:rPr>
+        <w:t xml:space="preserve">80 paying B2B customers</w:t>
+      </w:r>
+    </w:p>
+    <w:p>
+      <w:pPr>
+        <w:pStyle w:val="ListParagraph"/>
+        <w:numPr>
+          <w:ilvl w:val="0"/>
+          <w:numId w:val="1"/>
+        </w:numPr>
+        <w:spacing w:after="60"/>
+      </w:pPr>
+      <w:r>
+        <w:rPr>
+          <w:sz w:val="21"/>
+          <w:szCs w:val="21"/>
+        </w:rPr>
+        <w:t xml:space="preserve">500,000+ minutes of conversations in production</w:t>
+      </w:r>
+    </w:p>
+    <w:p>
+      <w:pPr>
+        <w:pStyle w:val="ListParagraph"/>
+        <w:numPr>
+          <w:ilvl w:val="0"/>
+          <w:numId w:val="1"/>
+        </w:numPr>
+        <w:spacing w:after="60"/>
+      </w:pPr>
+      <w:r>
+        <w:rPr>
+          <w:sz w:val="21"/>
+          <w:szCs w:val="21"/>
+        </w:rPr>
+        <w:t xml:space="preserve">+30% average customer spend after the new plans launched</w:t>
+      </w:r>
+    </w:p>
+    <w:p>
+      <w:pPr>
+        <w:pStyle w:val="ListParagraph"/>
+        <w:numPr>
+          <w:ilvl w:val="0"/>
+          <w:numId w:val="1"/>
+        </w:numPr>
+        <w:spacing w:after="60"/>
+      </w:pPr>
+      <w:r>
+        <w:rPr>
+          <w:sz w:val="21"/>
+          <w:szCs w:val="21"/>
+        </w:rPr>
+        <w:t xml:space="preserve">30% of line revenue comes from repeat purchases</w:t>
+      </w:r>
+    </w:p>
+    <w:p>
+      <w:pPr>
+        <w:pStyle w:val="ListParagraph"/>
+        <w:numPr>
+          <w:ilvl w:val="0"/>
+          <w:numId w:val="1"/>
+        </w:numPr>
+        <w:spacing w:after="60"/>
+      </w:pPr>
+      <w:r>
+        <w:rPr>
+          <w:sz w:val="21"/>
+          <w:szCs w:val="21"/>
+        </w:rPr>
+        <w:t xml:space="preserve">130+ countries: the group CPaaS products, bulk calls and SMS</w:t>
       </w:r>
     </w:p>
     <w:p>
@@ -205,109 +239,109 @@
           <w:sz w:val="21"/>
           <w:szCs w:val="21"/>
         </w:rPr>
-        <w:t xml:space="preserve">Zvonobot AI (fall 2025 - present)</w:t>
-      </w:r>
-    </w:p>
-    <w:p>
-      <w:pPr>
-        <w:pStyle w:val="ListParagraph"/>
-        <w:numPr>
-          <w:ilvl w:val="0"/>
-          <w:numId w:val="1"/>
-        </w:numPr>
-        <w:spacing w:after="60"/>
-      </w:pPr>
-      <w:r>
-        <w:rPr>
-          <w:sz w:val="21"/>
-          <w:szCs w:val="21"/>
-        </w:rPr>
-        <w:t xml:space="preserve">Launched Zvonobot AI, the voice AI agent line, from scratch: went to market on a white-label platform in weeks, proved demand with live customers, and made the case to build an in-house platform.</w:t>
-      </w:r>
-    </w:p>
-    <w:p>
-      <w:pPr>
-        <w:pStyle w:val="ListParagraph"/>
-        <w:numPr>
-          <w:ilvl w:val="0"/>
-          <w:numId w:val="1"/>
-        </w:numPr>
-        <w:spacing w:after="60"/>
-      </w:pPr>
-      <w:r>
-        <w:rPr>
-          <w:sz w:val="21"/>
-          <w:szCs w:val="21"/>
-        </w:rPr>
-        <w:t xml:space="preserve">By August 2026: 80 paying business customers and 500,000+ minutes of live conversations in production. Retention of the paying base: 30% of the line revenue comes from repeat payments.</w:t>
-      </w:r>
-    </w:p>
-    <w:p>
-      <w:pPr>
-        <w:pStyle w:val="ListParagraph"/>
-        <w:numPr>
-          <w:ilvl w:val="0"/>
-          <w:numId w:val="1"/>
-        </w:numPr>
-        <w:spacing w:after="60"/>
-      </w:pPr>
-      <w:r>
-        <w:rPr>
-          <w:sz w:val="21"/>
-          <w:szCs w:val="21"/>
-        </w:rPr>
-        <w:t xml:space="preserve">The hypothesis "AI plans will lift average spend" was confirmed after launch: +30%. AI agents consistently outperform legacy robocalls on conversion to the target action on warm lead lists, which became the basis for pricing.</w:t>
-      </w:r>
-    </w:p>
-    <w:p>
-      <w:pPr>
-        <w:pStyle w:val="ListParagraph"/>
-        <w:numPr>
-          <w:ilvl w:val="0"/>
-          <w:numId w:val="1"/>
-        </w:numPr>
-        <w:spacing w:after="60"/>
-      </w:pPr>
-      <w:r>
-        <w:rPr>
-          <w:sz w:val="21"/>
-          <w:szCs w:val="21"/>
-        </w:rPr>
-        <w:t xml:space="preserve">Built the AI product suite: agent and script builder, LLM call analytics (outcome, sentiment, custom post-call fields), per-second billing plans by cost component (LLM, ASR, TTS), balance hold at campaign start.</w:t>
-      </w:r>
-    </w:p>
-    <w:p>
-      <w:pPr>
-        <w:pStyle w:val="ListParagraph"/>
-        <w:numPr>
-          <w:ilvl w:val="0"/>
-          <w:numId w:val="1"/>
-        </w:numPr>
-        <w:spacing w:after="60"/>
-      </w:pPr>
-      <w:r>
-        <w:rPr>
-          <w:sz w:val="21"/>
-          <w:szCs w:val="21"/>
-        </w:rPr>
-        <w:t xml:space="preserve">Lead the product team of 4 engineers: engineering reports to the tech lead, while priorities, specs and acceptance are mine. Set quarterly OKRs for the line and defend them with leadership.</w:t>
-      </w:r>
-    </w:p>
-    <w:p>
-      <w:pPr>
-        <w:pStyle w:val="ListParagraph"/>
-        <w:numPr>
-          <w:ilvl w:val="0"/>
-          <w:numId w:val="1"/>
-        </w:numPr>
-        <w:spacing w:after="60"/>
-      </w:pPr>
-      <w:r>
-        <w:rPr>
-          <w:sz w:val="21"/>
-          <w:szCs w:val="21"/>
-        </w:rPr>
-        <w:t xml:space="preserve">Run go-to-market with stakeholders in sales, support and finance: the sales team grew from 4 to 15 people to sell the line, and I train sales and support on the product weekly. Own pricing, plans, per-call-type margins and the unit economics of the line.</w:t>
+        <w:t xml:space="preserve">Zvonobot AI (Oct 2025 - present)</w:t>
+      </w:r>
+    </w:p>
+    <w:p>
+      <w:pPr>
+        <w:pStyle w:val="ListParagraph"/>
+        <w:numPr>
+          <w:ilvl w:val="0"/>
+          <w:numId w:val="1"/>
+        </w:numPr>
+        <w:spacing w:after="60"/>
+      </w:pPr>
+      <w:r>
+        <w:rPr>
+          <w:sz w:val="21"/>
+          <w:szCs w:val="21"/>
+        </w:rPr>
+        <w:t xml:space="preserve">~10% of group revenue in under a year: 80 paying B2B customers and 500,000+ minutes of live conversations in production by August 2026. Repeat purchases bring 30% of the line revenue.</w:t>
+      </w:r>
+    </w:p>
+    <w:p>
+      <w:pPr>
+        <w:pStyle w:val="ListParagraph"/>
+        <w:numPr>
+          <w:ilvl w:val="0"/>
+          <w:numId w:val="1"/>
+        </w:numPr>
+        <w:spacing w:after="60"/>
+      </w:pPr>
+      <w:r>
+        <w:rPr>
+          <w:sz w:val="21"/>
+          <w:szCs w:val="21"/>
+        </w:rPr>
+        <w:t xml:space="preserve">From zero to market in weeks: launched Zvonobot AI, the voice AI agent line, on a white-label platform and proved demand with live customers. Now moving the line to our own, more flexible platform.</w:t>
+      </w:r>
+    </w:p>
+    <w:p>
+      <w:pPr>
+        <w:pStyle w:val="ListParagraph"/>
+        <w:numPr>
+          <w:ilvl w:val="0"/>
+          <w:numId w:val="1"/>
+        </w:numPr>
+        <w:spacing w:after="60"/>
+      </w:pPr>
+      <w:r>
+        <w:rPr>
+          <w:sz w:val="21"/>
+          <w:szCs w:val="21"/>
+        </w:rPr>
+        <w:t xml:space="preserve">+30% in average customer spend after the AI plans launched: customers on AI agents versus customers on the legacy linear IVR robot. AI agents consistently outperform the scripted robots on conversion to the target action on warm lead lists, which became the basis for pricing.</w:t>
+      </w:r>
+    </w:p>
+    <w:p>
+      <w:pPr>
+        <w:pStyle w:val="ListParagraph"/>
+        <w:numPr>
+          <w:ilvl w:val="0"/>
+          <w:numId w:val="1"/>
+        </w:numPr>
+        <w:spacing w:after="60"/>
+      </w:pPr>
+      <w:r>
+        <w:rPr>
+          <w:sz w:val="21"/>
+          <w:szCs w:val="21"/>
+        </w:rPr>
+        <w:t xml:space="preserve">The full product suite of the line: agent and script builder, LLM call analytics (outcome, sentiment, custom post-call fields), per-second billing plans by cost component (LLM, ASR, TTS), balance hold at campaign start.</w:t>
+      </w:r>
+    </w:p>
+    <w:p>
+      <w:pPr>
+        <w:pStyle w:val="ListParagraph"/>
+        <w:numPr>
+          <w:ilvl w:val="0"/>
+          <w:numId w:val="1"/>
+        </w:numPr>
+        <w:spacing w:after="60"/>
+      </w:pPr>
+      <w:r>
+        <w:rPr>
+          <w:sz w:val="21"/>
+          <w:szCs w:val="21"/>
+        </w:rPr>
+        <w:t xml:space="preserve">A product team of 4 engineers: engineering reports to the tech lead, while priorities, specs and acceptance are mine. Set quarterly OKRs for the line and defend them with leadership.</w:t>
+      </w:r>
+    </w:p>
+    <w:p>
+      <w:pPr>
+        <w:pStyle w:val="ListParagraph"/>
+        <w:numPr>
+          <w:ilvl w:val="0"/>
+          <w:numId w:val="1"/>
+        </w:numPr>
+        <w:spacing w:after="60"/>
+      </w:pPr>
+      <w:r>
+        <w:rPr>
+          <w:sz w:val="21"/>
+          <w:szCs w:val="21"/>
+        </w:rPr>
+        <w:t xml:space="preserve">The sales team grew from 4 to 15 people to sell the line: I run go-to-market with stakeholders in sales, support and finance, and train sales and support on the product weekly. Own pricing, plans, per-call-type margins and the product's unit economics.</w:t>
       </w:r>
     </w:p>
     <w:p>
@@ -338,58 +372,75 @@
           <w:sz w:val="21"/>
           <w:szCs w:val="21"/>
         </w:rPr>
-        <w:t xml:space="preserve">Owned the core B2B SaaS platform end to end: self-service customer console, campaign creation and lead-list targeting, script builder, telephony, per-second billing, wallets, reporting and call analytics; prioritized by metrics and data.</w:t>
-      </w:r>
-    </w:p>
-    <w:p>
-      <w:pPr>
-        <w:pStyle w:val="ListParagraph"/>
-        <w:numPr>
-          <w:ilvl w:val="0"/>
-          <w:numId w:val="1"/>
-        </w:numPr>
-        <w:spacing w:after="60"/>
-      </w:pPr>
-      <w:r>
-        <w:rPr>
-          <w:sz w:val="21"/>
-          <w:szCs w:val="21"/>
-        </w:rPr>
-        <w:t xml:space="preserve">Launched a virtual PBX as a complementary product to raise customer retention.</w:t>
-      </w:r>
-    </w:p>
-    <w:p>
-      <w:pPr>
-        <w:pStyle w:val="ListParagraph"/>
-        <w:numPr>
-          <w:ilvl w:val="0"/>
-          <w:numId w:val="1"/>
-        </w:numPr>
-        <w:spacing w:after="60"/>
-      </w:pPr>
-      <w:r>
-        <w:rPr>
-          <w:sz w:val="21"/>
-          <w:szCs w:val="21"/>
-        </w:rPr>
-        <w:t xml:space="preserve">Set up discovery and delivery: customer interviews, hypotheses formulated and defended with metrics, A/B testing of call scripts, effect sizing before development, decomposition and PRDs, a release cycle run jointly with sales, support and engineering.</w:t>
-      </w:r>
-    </w:p>
-    <w:p>
-      <w:pPr>
-        <w:pStyle w:val="ListParagraph"/>
-        <w:numPr>
-          <w:ilvl w:val="0"/>
-          <w:numId w:val="1"/>
-        </w:numPr>
-        <w:spacing w:after="60"/>
-      </w:pPr>
-      <w:r>
-        <w:rPr>
-          <w:sz w:val="21"/>
-          <w:szCs w:val="21"/>
-        </w:rPr>
-        <w:t xml:space="preserve">Introduced LLM tooling and vibe coding across company workflows: built a voice bot MVP on the OpenAI Realtime API in 2 days and an internal analytics tool over the database in 4 days; work with Claude Code and Codex daily.</w:t>
+        <w:t xml:space="preserve">The core B2B SaaS platform end to end: self-service customer console, campaign creation and lead-list targeting, script builder, telephony, per-second billing, wallets, reporting and call analytics. Prioritization by metrics and data.</w:t>
+      </w:r>
+    </w:p>
+    <w:p>
+      <w:pPr>
+        <w:pStyle w:val="ListParagraph"/>
+        <w:numPr>
+          <w:ilvl w:val="0"/>
+          <w:numId w:val="1"/>
+        </w:numPr>
+        <w:spacing w:after="60"/>
+      </w:pPr>
+      <w:r>
+        <w:rPr>
+          <w:sz w:val="21"/>
+          <w:szCs w:val="21"/>
+        </w:rPr>
+        <w:t xml:space="preserve">130+ countries, bulk calls and SMS: ran the group CPaaS products, Effebot (Zvonobot's international brand) and P1SMS. Traffic routing across providers, billing, API integrations.</w:t>
+      </w:r>
+    </w:p>
+    <w:p>
+      <w:pPr>
+        <w:pStyle w:val="ListParagraph"/>
+        <w:numPr>
+          <w:ilvl w:val="0"/>
+          <w:numId w:val="1"/>
+        </w:numPr>
+        <w:spacing w:after="60"/>
+      </w:pPr>
+      <w:r>
+        <w:rPr>
+          <w:sz w:val="21"/>
+          <w:szCs w:val="21"/>
+        </w:rPr>
+        <w:t xml:space="preserve">A virtual PBX launched as a complementary product to raise customer retention.</w:t>
+      </w:r>
+    </w:p>
+    <w:p>
+      <w:pPr>
+        <w:pStyle w:val="ListParagraph"/>
+        <w:numPr>
+          <w:ilvl w:val="0"/>
+          <w:numId w:val="1"/>
+        </w:numPr>
+        <w:spacing w:after="60"/>
+      </w:pPr>
+      <w:r>
+        <w:rPr>
+          <w:sz w:val="21"/>
+          <w:szCs w:val="21"/>
+        </w:rPr>
+        <w:t xml:space="preserve">A full discovery and delivery loop: customer interviews, hypotheses formulated and defended with metrics, A/B testing of call scripts, effect sizing before development, decomposition and PRDs, a cross-functional release cycle run jointly with sales, support and engineering.</w:t>
+      </w:r>
+    </w:p>
+    <w:p>
+      <w:pPr>
+        <w:pStyle w:val="ListParagraph"/>
+        <w:numPr>
+          <w:ilvl w:val="0"/>
+          <w:numId w:val="1"/>
+        </w:numPr>
+        <w:spacing w:after="60"/>
+      </w:pPr>
+      <w:r>
+        <w:rPr>
+          <w:sz w:val="21"/>
+          <w:szCs w:val="21"/>
+        </w:rPr>
+        <w:t xml:space="preserve">A voice bot MVP on the OpenAI Realtime API in 2 days and an internal analytics tool over the database in 4 days: brought LLM tooling and AI-assisted prototyping into company workflows. Work with Claude Code and Codex daily.</w:t>
       </w:r>
     </w:p>
     <w:p>
@@ -420,7 +471,7 @@
           <w:sz w:val="21"/>
           <w:szCs w:val="21"/>
         </w:rPr>
-        <w:t xml:space="preserve">Shipped a web product for the EU market: a self-service web account, Spanish localization, reporting and compliance features, usability testing with users.</w:t>
+        <w:t xml:space="preserve">A web product for the EU market: a self-service web account, Spanish localization, reporting and compliance features, usability testing.</w:t>
       </w:r>
     </w:p>
     <w:p>
@@ -452,58 +503,41 @@
           <w:sz w:val="21"/>
           <w:szCs w:val="21"/>
         </w:rPr>
-        <w:t xml:space="preserve">Zvonobot AI - A B2B voice AI agent platform: agent builder, campaigns, telephony, per-second billing. Proves a line taken from zero to 80 paying customers in under a year. Case study: https://rebsem.ru/projects/zvonobot-ai-en/</w:t>
-      </w:r>
-    </w:p>
-    <w:p>
-      <w:pPr>
-        <w:pStyle w:val="ListParagraph"/>
-        <w:numPr>
-          <w:ilvl w:val="0"/>
-          <w:numId w:val="1"/>
-        </w:numPr>
-        <w:spacing w:after="60"/>
-      </w:pPr>
-      <w:r>
-        <w:rPr>
-          <w:sz w:val="21"/>
-          <w:szCs w:val="21"/>
-        </w:rPr>
-        <w:t xml:space="preserve">cursivo - An AI CRM for car rental, live in production: reads client documents, scores deal risk, suggests the next step. Proves I take a product to live users outside the day job. Case study: https://rebsem.ru/projects/cursivo-en/ · https://cursivo.xyz</w:t>
-      </w:r>
-    </w:p>
-    <w:p>
-      <w:pPr>
-        <w:pStyle w:val="ListParagraph"/>
-        <w:numPr>
-          <w:ilvl w:val="0"/>
-          <w:numId w:val="1"/>
-        </w:numPr>
-        <w:spacing w:after="60"/>
-      </w:pPr>
-      <w:r>
-        <w:rPr>
-          <w:sz w:val="21"/>
-          <w:szCs w:val="21"/>
-        </w:rPr>
-        <w:t xml:space="preserve">obrabot - An internal voice AI analytics console: an LLM segments calls and surfaces what needs human attention. Proves LLM analytics built on top of real production data. Case study: https://rebsem.ru/projects/obrabot-en/</w:t>
-      </w:r>
-    </w:p>
-    <w:p>
-      <w:pPr>
-        <w:pStyle w:val="ListParagraph"/>
-        <w:numPr>
-          <w:ilvl w:val="0"/>
-          <w:numId w:val="1"/>
-        </w:numPr>
-        <w:spacing w:after="60"/>
-      </w:pPr>
-      <w:r>
-        <w:rPr>
-          <w:sz w:val="21"/>
-          <w:szCs w:val="21"/>
-        </w:rPr>
-        <w:t xml:space="preserve">pet projects - Side projects built personally with AI coding agents (Claude Code, Codex) in 1-7 days from idea to a working release. Proves hypothesis-validation speed and a shared language with engineers. https://github.com/RebSem</w:t>
+        <w:t xml:space="preserve">Zvonobot AI: 80 customers, 500,000+ minutes. A B2B voice AI agent platform: agent builder, campaigns, telephony, per-second billing. Proves a new line launched from zero to a visible share of group revenue in a year. Case study: https://rebsem.ru/projects/zvonobot-ai-en/ · https://zvonobot.ru/ai-agent</w:t>
+      </w:r>
+    </w:p>
+    <w:p>
+      <w:pPr>
+        <w:pStyle w:val="ListParagraph"/>
+        <w:numPr>
+          <w:ilvl w:val="0"/>
+          <w:numId w:val="1"/>
+        </w:numPr>
+        <w:spacing w:after="60"/>
+      </w:pPr>
+      <w:r>
+        <w:rPr>
+          <w:sz w:val="21"/>
+          <w:szCs w:val="21"/>
+        </w:rPr>
+        <w:t xml:space="preserve">cursivo: In development. An AI CRM for car rental: reads client documents, scores deal risk, suggests the next step. My own product, from idea to a working system, outside the day job. Case study: https://rebsem.ru/projects/cursivo-en/ · https://cursivo.xyz</w:t>
+      </w:r>
+    </w:p>
+    <w:p>
+      <w:pPr>
+        <w:pStyle w:val="ListParagraph"/>
+        <w:numPr>
+          <w:ilvl w:val="0"/>
+          <w:numId w:val="1"/>
+        </w:numPr>
+        <w:spacing w:after="60"/>
+      </w:pPr>
+      <w:r>
+        <w:rPr>
+          <w:sz w:val="21"/>
+          <w:szCs w:val="21"/>
+        </w:rPr>
+        <w:t xml:space="preserve">obrabot: Live in production, internal Prof-IT tool. An internal voice AI analytics console: an LLM segments calls and surfaces what needs human attention. LLM analytics built on top of real production data. Case study: https://rebsem.ru/projects/obrabot-en/</w:t>
       </w:r>
     </w:p>
     <w:p>
@@ -560,7 +594,7 @@
           <w:sz w:val="21"/>
           <w:szCs w:val="21"/>
         </w:rPr>
-        <w:t xml:space="preserve">product strategy and roadmap, discovery, customer interviews, metrics and product analytics, unit economics (LTV, CAC, retention, average spend), pricing, A/B experiments, hypothesis validation, go-to-market, OKRs, B2B SaaS, CRM</w:t>
+        <w:t xml:space="preserve">product strategy and roadmap, discovery, customer interviews, metrics and product analytics, unit economics (LTV, CAC, retention and churn, average spend), pricing and monetization, A/B experiments, hypothesis validation, go-to-market, OKRs, stakeholder management, B2B SaaS, CRM</w:t>
       </w:r>
     </w:p>
     <w:p>
@@ -581,7 +615,7 @@
           <w:sz w:val="21"/>
           <w:szCs w:val="21"/>
         </w:rPr>
-        <w:t xml:space="preserve">voice AI agents, conversational AI, LLM orchestration, prompt engineering, RAG, LLM evals, ASR, TTS, contact centers, SIP telephony, AI tools in daily work</w:t>
+        <w:t xml:space="preserve">generative AI (GenAI), voice AI agents, conversational AI, LLM orchestration, prompt engineering, RAG, LLM evals, ASR, TTS, contact centers, SIP telephony</w:t>
       </w:r>
     </w:p>
     <w:p>
@@ -602,7 +636,7 @@
           <w:sz w:val="21"/>
           <w:szCs w:val="21"/>
         </w:rPr>
-        <w:t xml:space="preserve">PRDs and specs, decomposition, spec, review, release cycle, working with engineers and sales, prototyping with AI coding agents (Claude Code, Codex), fast hypothesis validation, 0 to 1</w:t>
+        <w:t xml:space="preserve">PRDs and specs, decomposition, acceptance criteria, reviews, release cycle, working with engineers and sales, fast hypothesis validation, 0 to 1</w:t>
       </w:r>
     </w:p>
     <w:p>
@@ -637,6 +671,27 @@
           <w:sz w:val="21"/>
           <w:szCs w:val="21"/>
         </w:rPr>
+        <w:t xml:space="preserve">AI tools: </w:t>
+      </w:r>
+      <w:r>
+        <w:rPr>
+          <w:sz w:val="21"/>
+          <w:szCs w:val="21"/>
+        </w:rPr>
+        <w:t xml:space="preserve">Claude Code, Codex, prototyping with AI agents</w:t>
+      </w:r>
+    </w:p>
+    <w:p>
+      <w:pPr>
+        <w:spacing w:after="60"/>
+      </w:pPr>
+      <w:r>
+        <w:rPr>
+          <w:b/>
+          <w:bCs/>
+          <w:sz w:val="21"/>
+          <w:szCs w:val="21"/>
+        </w:rPr>
         <w:t xml:space="preserve">Technical: </w:t>
       </w:r>
       <w:r>
@@ -644,7 +699,7 @@
           <w:sz w:val="21"/>
           <w:szCs w:val="21"/>
         </w:rPr>
-        <w:t xml:space="preserve">SQL, Python, TypeScript, REST, integrations, telephony</w:t>
+        <w:t xml:space="preserve">SQL, Python, TypeScript, REST, integrations, telephony (SIP)</w:t>
       </w:r>
     </w:p>
     <w:p>
@@ -659,6 +714,33 @@
           <w:sz w:val="24"/>
           <w:szCs w:val="24"/>
         </w:rPr>
+        <w:t xml:space="preserve">WHAT I AM LOOKING FOR</w:t>
+      </w:r>
+    </w:p>
+    <w:p>
+      <w:pPr>
+        <w:spacing w:after="80"/>
+      </w:pPr>
+      <w:r>
+        <w:rPr>
+          <w:sz w:val="21"/>
+          <w:szCs w:val="21"/>
+        </w:rPr>
+        <w:t xml:space="preserve">A Product Manager or Product Owner role on a product team. Domains where my experience works from day one: B2B SaaS, AI and LLM products, payments and billing, telecom and CPaaS, infrastructure platforms with integrations and APIs. I am at my best where a product needs to be launched from zero or taken from MVP to growth.</w:t>
+      </w:r>
+    </w:p>
+    <w:p>
+      <w:pPr>
+        <w:pStyle w:val="Heading2"/>
+        <w:spacing w:after="100" w:before="260"/>
+      </w:pPr>
+      <w:r>
+        <w:rPr>
+          <w:b/>
+          <w:bCs/>
+          <w:sz w:val="24"/>
+          <w:szCs w:val="24"/>
+        </w:rPr>
         <w:t xml:space="preserve">EDUCATION, LANGUAGES, FORMAT</w:t>
       </w:r>
     </w:p>
@@ -701,7 +783,7 @@
           <w:sz w:val="21"/>
           <w:szCs w:val="21"/>
         </w:rPr>
-        <w:t xml:space="preserve">Russian: native. English: working proficiency, daily written use, comfortable on work calls.</w:t>
+        <w:t xml:space="preserve">Russian: native. English: B1+, working correspondence and documentation daily, confident on work calls.</w:t>
       </w:r>
     </w:p>
     <w:p>

</xml_diff>

<commit_message>
feat: redesign the resume with six metric tiles and honest CPaaS/cursivo copy (#52)
Rebuilds /cv and /ru/cv to the 24 Aug 2026 spec: six machine-readable metric
tiles (share of group revenue leads, sales headcount growth moved into its
GTM bullet), a positive "What I am looking for" section replacing the old
anti-fit list, CPaaS experience, and one metric line per product card with
a working link to the public Zvonobot AI landing page.

A follow-up multi-persona HR review (RU/international recruiter, ATS/LLM
screener, hiring CPO) then tightened wording across both locales: a leaner
header with no duplicate contact channels, honest "in development" status
for cursivo instead of implying live users, deduplicated headline numbers,
parseable dates, and machine-layer fixes (canonical/hreflang slashes,
Person alumniOf, Telegram spelled out in the printed PDF).
</commit_message>
<xml_diff>
--- a/public/cv/Mikhail_Semenov_CV_EN.docx
+++ b/public/cv/Mikhail_Semenov_CV_EN.docx
@@ -40,7 +40,7 @@
           <w:sz w:val="19"/>
           <w:szCs w:val="19"/>
         </w:rPr>
-        <w:t xml:space="preserve">Perm, Russia (GMT+5) · Remote · Open to relocation (Cyprus, EU, UAE) · Available for business travel · Telegram @Michael_Semenov · perk77331@gmail.com · rebsem.ru · linkedin.com/in/mikhail-semenovv · github.com/RebSem</w:t>
+        <w:t xml:space="preserve">Perm, Russia (GMT+5) · Remote · Open to relocation (Cyprus, EU, UAE) · Telegram @Michael_Semenov · perk77331@gmail.com · rebsem.ru · linkedin.com/in/mikhail-semenovv · github.com/RebSem</w:t>
       </w:r>
     </w:p>
     <w:p>
@@ -67,7 +67,7 @@
           <w:sz w:val="21"/>
           <w:szCs w:val="21"/>
         </w:rPr>
-        <w:t xml:space="preserve">Product manager with an engineering background, 4.5 years in product. Launched Zvonobot AI, a B2B voice AI agent line, from zero to 80 paying business customers and 500,000+ minutes of live conversations in production in under a year. Lead the product team of 4 engineers, set quarterly goals for the line, own pricing, unit economics and go-to-market. Prototype with AI coding agents in days. Open to full-time or contract work; can start within 2-4 weeks.</w:t>
+        <w:t xml:space="preserve">Product manager with an engineering background, 4.5 years in B2B SaaS. Launched a voice AI agent line from zero to 80 paying customers, 500,000+ minutes in production and ~10% of group revenue in under a year. Currently lead a product team of 4 engineers, own pricing, unit economics and new line launches.</w:t>
       </w:r>
     </w:p>
     <w:p>
@@ -99,58 +99,92 @@
           <w:sz w:val="21"/>
           <w:szCs w:val="21"/>
         </w:rPr>
-        <w:t xml:space="preserve">80 paying B2B customers: repeat payments account for 30% of the line revenue.</w:t>
-      </w:r>
-    </w:p>
-    <w:p>
-      <w:pPr>
-        <w:pStyle w:val="ListParagraph"/>
-        <w:numPr>
-          <w:ilvl w:val="0"/>
-          <w:numId w:val="1"/>
-        </w:numPr>
-        <w:spacing w:after="60"/>
-      </w:pPr>
-      <w:r>
-        <w:rPr>
-          <w:sz w:val="21"/>
-          <w:szCs w:val="21"/>
-        </w:rPr>
-        <w:t xml:space="preserve">500,000+ minutes of conversation: handled by the voice AI agents in production.</w:t>
-      </w:r>
-    </w:p>
-    <w:p>
-      <w:pPr>
-        <w:pStyle w:val="ListParagraph"/>
-        <w:numPr>
-          <w:ilvl w:val="0"/>
-          <w:numId w:val="1"/>
-        </w:numPr>
-        <w:spacing w:after="60"/>
-      </w:pPr>
-      <w:r>
-        <w:rPr>
-          <w:sz w:val="21"/>
-          <w:szCs w:val="21"/>
-        </w:rPr>
-        <w:t xml:space="preserve">4 → 15 people on the sales team: grew to sell the line in under a year.</w:t>
-      </w:r>
-    </w:p>
-    <w:p>
-      <w:pPr>
-        <w:pStyle w:val="ListParagraph"/>
-        <w:numPr>
-          <w:ilvl w:val="0"/>
-          <w:numId w:val="1"/>
-        </w:numPr>
-        <w:spacing w:after="60"/>
-      </w:pPr>
-      <w:r>
-        <w:rPr>
-          <w:sz w:val="21"/>
-          <w:szCs w:val="21"/>
-        </w:rPr>
-        <w:t xml:space="preserve">+30% average customer spend: growth in average spend after the AI plans launched.</w:t>
+        <w:t xml:space="preserve">~10% of group revenue comes from a line launched from zero in a year</w:t>
+      </w:r>
+    </w:p>
+    <w:p>
+      <w:pPr>
+        <w:pStyle w:val="ListParagraph"/>
+        <w:numPr>
+          <w:ilvl w:val="0"/>
+          <w:numId w:val="1"/>
+        </w:numPr>
+        <w:spacing w:after="60"/>
+      </w:pPr>
+      <w:r>
+        <w:rPr>
+          <w:sz w:val="21"/>
+          <w:szCs w:val="21"/>
+        </w:rPr>
+        <w:t xml:space="preserve">80 paying B2B customers</w:t>
+      </w:r>
+    </w:p>
+    <w:p>
+      <w:pPr>
+        <w:pStyle w:val="ListParagraph"/>
+        <w:numPr>
+          <w:ilvl w:val="0"/>
+          <w:numId w:val="1"/>
+        </w:numPr>
+        <w:spacing w:after="60"/>
+      </w:pPr>
+      <w:r>
+        <w:rPr>
+          <w:sz w:val="21"/>
+          <w:szCs w:val="21"/>
+        </w:rPr>
+        <w:t xml:space="preserve">500,000+ minutes of conversations in production</w:t>
+      </w:r>
+    </w:p>
+    <w:p>
+      <w:pPr>
+        <w:pStyle w:val="ListParagraph"/>
+        <w:numPr>
+          <w:ilvl w:val="0"/>
+          <w:numId w:val="1"/>
+        </w:numPr>
+        <w:spacing w:after="60"/>
+      </w:pPr>
+      <w:r>
+        <w:rPr>
+          <w:sz w:val="21"/>
+          <w:szCs w:val="21"/>
+        </w:rPr>
+        <w:t xml:space="preserve">+30% average customer spend after the new plans launched</w:t>
+      </w:r>
+    </w:p>
+    <w:p>
+      <w:pPr>
+        <w:pStyle w:val="ListParagraph"/>
+        <w:numPr>
+          <w:ilvl w:val="0"/>
+          <w:numId w:val="1"/>
+        </w:numPr>
+        <w:spacing w:after="60"/>
+      </w:pPr>
+      <w:r>
+        <w:rPr>
+          <w:sz w:val="21"/>
+          <w:szCs w:val="21"/>
+        </w:rPr>
+        <w:t xml:space="preserve">30% of line revenue comes from repeat purchases</w:t>
+      </w:r>
+    </w:p>
+    <w:p>
+      <w:pPr>
+        <w:pStyle w:val="ListParagraph"/>
+        <w:numPr>
+          <w:ilvl w:val="0"/>
+          <w:numId w:val="1"/>
+        </w:numPr>
+        <w:spacing w:after="60"/>
+      </w:pPr>
+      <w:r>
+        <w:rPr>
+          <w:sz w:val="21"/>
+          <w:szCs w:val="21"/>
+        </w:rPr>
+        <w:t xml:space="preserve">130+ countries: the group CPaaS products, bulk calls and SMS</w:t>
       </w:r>
     </w:p>
     <w:p>
@@ -205,109 +239,109 @@
           <w:sz w:val="21"/>
           <w:szCs w:val="21"/>
         </w:rPr>
-        <w:t xml:space="preserve">Zvonobot AI (fall 2025 - present)</w:t>
-      </w:r>
-    </w:p>
-    <w:p>
-      <w:pPr>
-        <w:pStyle w:val="ListParagraph"/>
-        <w:numPr>
-          <w:ilvl w:val="0"/>
-          <w:numId w:val="1"/>
-        </w:numPr>
-        <w:spacing w:after="60"/>
-      </w:pPr>
-      <w:r>
-        <w:rPr>
-          <w:sz w:val="21"/>
-          <w:szCs w:val="21"/>
-        </w:rPr>
-        <w:t xml:space="preserve">Launched Zvonobot AI, the voice AI agent line, from scratch: went to market on a white-label platform in weeks, proved demand with live customers, and made the case to build an in-house platform.</w:t>
-      </w:r>
-    </w:p>
-    <w:p>
-      <w:pPr>
-        <w:pStyle w:val="ListParagraph"/>
-        <w:numPr>
-          <w:ilvl w:val="0"/>
-          <w:numId w:val="1"/>
-        </w:numPr>
-        <w:spacing w:after="60"/>
-      </w:pPr>
-      <w:r>
-        <w:rPr>
-          <w:sz w:val="21"/>
-          <w:szCs w:val="21"/>
-        </w:rPr>
-        <w:t xml:space="preserve">By August 2026: 80 paying business customers and 500,000+ minutes of live conversations in production. Retention of the paying base: 30% of the line revenue comes from repeat payments.</w:t>
-      </w:r>
-    </w:p>
-    <w:p>
-      <w:pPr>
-        <w:pStyle w:val="ListParagraph"/>
-        <w:numPr>
-          <w:ilvl w:val="0"/>
-          <w:numId w:val="1"/>
-        </w:numPr>
-        <w:spacing w:after="60"/>
-      </w:pPr>
-      <w:r>
-        <w:rPr>
-          <w:sz w:val="21"/>
-          <w:szCs w:val="21"/>
-        </w:rPr>
-        <w:t xml:space="preserve">The hypothesis "AI plans will lift average spend" was confirmed after launch: +30%. AI agents consistently outperform legacy robocalls on conversion to the target action on warm lead lists, which became the basis for pricing.</w:t>
-      </w:r>
-    </w:p>
-    <w:p>
-      <w:pPr>
-        <w:pStyle w:val="ListParagraph"/>
-        <w:numPr>
-          <w:ilvl w:val="0"/>
-          <w:numId w:val="1"/>
-        </w:numPr>
-        <w:spacing w:after="60"/>
-      </w:pPr>
-      <w:r>
-        <w:rPr>
-          <w:sz w:val="21"/>
-          <w:szCs w:val="21"/>
-        </w:rPr>
-        <w:t xml:space="preserve">Built the AI product suite: agent and script builder, LLM call analytics (outcome, sentiment, custom post-call fields), per-second billing plans by cost component (LLM, ASR, TTS), balance hold at campaign start.</w:t>
-      </w:r>
-    </w:p>
-    <w:p>
-      <w:pPr>
-        <w:pStyle w:val="ListParagraph"/>
-        <w:numPr>
-          <w:ilvl w:val="0"/>
-          <w:numId w:val="1"/>
-        </w:numPr>
-        <w:spacing w:after="60"/>
-      </w:pPr>
-      <w:r>
-        <w:rPr>
-          <w:sz w:val="21"/>
-          <w:szCs w:val="21"/>
-        </w:rPr>
-        <w:t xml:space="preserve">Lead the product team of 4 engineers: engineering reports to the tech lead, while priorities, specs and acceptance are mine. Set quarterly OKRs for the line and defend them with leadership.</w:t>
-      </w:r>
-    </w:p>
-    <w:p>
-      <w:pPr>
-        <w:pStyle w:val="ListParagraph"/>
-        <w:numPr>
-          <w:ilvl w:val="0"/>
-          <w:numId w:val="1"/>
-        </w:numPr>
-        <w:spacing w:after="60"/>
-      </w:pPr>
-      <w:r>
-        <w:rPr>
-          <w:sz w:val="21"/>
-          <w:szCs w:val="21"/>
-        </w:rPr>
-        <w:t xml:space="preserve">Run go-to-market with stakeholders in sales, support and finance: the sales team grew from 4 to 15 people to sell the line, and I train sales and support on the product weekly. Own pricing, plans, per-call-type margins and the unit economics of the line.</w:t>
+        <w:t xml:space="preserve">Zvonobot AI (Oct 2025 - present)</w:t>
+      </w:r>
+    </w:p>
+    <w:p>
+      <w:pPr>
+        <w:pStyle w:val="ListParagraph"/>
+        <w:numPr>
+          <w:ilvl w:val="0"/>
+          <w:numId w:val="1"/>
+        </w:numPr>
+        <w:spacing w:after="60"/>
+      </w:pPr>
+      <w:r>
+        <w:rPr>
+          <w:sz w:val="21"/>
+          <w:szCs w:val="21"/>
+        </w:rPr>
+        <w:t xml:space="preserve">~10% of group revenue in under a year: 80 paying B2B customers and 500,000+ minutes of live conversations in production by August 2026. Repeat purchases bring 30% of the line revenue.</w:t>
+      </w:r>
+    </w:p>
+    <w:p>
+      <w:pPr>
+        <w:pStyle w:val="ListParagraph"/>
+        <w:numPr>
+          <w:ilvl w:val="0"/>
+          <w:numId w:val="1"/>
+        </w:numPr>
+        <w:spacing w:after="60"/>
+      </w:pPr>
+      <w:r>
+        <w:rPr>
+          <w:sz w:val="21"/>
+          <w:szCs w:val="21"/>
+        </w:rPr>
+        <w:t xml:space="preserve">From zero to market in weeks: launched Zvonobot AI, the voice AI agent line, on a white-label platform and proved demand with live customers. Now moving the line to our own, more flexible platform.</w:t>
+      </w:r>
+    </w:p>
+    <w:p>
+      <w:pPr>
+        <w:pStyle w:val="ListParagraph"/>
+        <w:numPr>
+          <w:ilvl w:val="0"/>
+          <w:numId w:val="1"/>
+        </w:numPr>
+        <w:spacing w:after="60"/>
+      </w:pPr>
+      <w:r>
+        <w:rPr>
+          <w:sz w:val="21"/>
+          <w:szCs w:val="21"/>
+        </w:rPr>
+        <w:t xml:space="preserve">+30% in average customer spend after the AI plans launched: customers on AI agents versus customers on the legacy linear IVR robot. AI agents consistently outperform the scripted robots on conversion to the target action on warm lead lists, which became the basis for pricing.</w:t>
+      </w:r>
+    </w:p>
+    <w:p>
+      <w:pPr>
+        <w:pStyle w:val="ListParagraph"/>
+        <w:numPr>
+          <w:ilvl w:val="0"/>
+          <w:numId w:val="1"/>
+        </w:numPr>
+        <w:spacing w:after="60"/>
+      </w:pPr>
+      <w:r>
+        <w:rPr>
+          <w:sz w:val="21"/>
+          <w:szCs w:val="21"/>
+        </w:rPr>
+        <w:t xml:space="preserve">The full product suite of the line: agent and script builder, LLM call analytics (outcome, sentiment, custom post-call fields), per-second billing plans by cost component (LLM, ASR, TTS), balance hold at campaign start.</w:t>
+      </w:r>
+    </w:p>
+    <w:p>
+      <w:pPr>
+        <w:pStyle w:val="ListParagraph"/>
+        <w:numPr>
+          <w:ilvl w:val="0"/>
+          <w:numId w:val="1"/>
+        </w:numPr>
+        <w:spacing w:after="60"/>
+      </w:pPr>
+      <w:r>
+        <w:rPr>
+          <w:sz w:val="21"/>
+          <w:szCs w:val="21"/>
+        </w:rPr>
+        <w:t xml:space="preserve">A product team of 4 engineers: engineering reports to the tech lead, while priorities, specs and acceptance are mine. Set quarterly OKRs for the line and defend them with leadership.</w:t>
+      </w:r>
+    </w:p>
+    <w:p>
+      <w:pPr>
+        <w:pStyle w:val="ListParagraph"/>
+        <w:numPr>
+          <w:ilvl w:val="0"/>
+          <w:numId w:val="1"/>
+        </w:numPr>
+        <w:spacing w:after="60"/>
+      </w:pPr>
+      <w:r>
+        <w:rPr>
+          <w:sz w:val="21"/>
+          <w:szCs w:val="21"/>
+        </w:rPr>
+        <w:t xml:space="preserve">The sales team grew from 4 to 15 people to sell the line: I run go-to-market with stakeholders in sales, support and finance, and train sales and support on the product weekly. Own pricing, plans, per-call-type margins and the product's unit economics.</w:t>
       </w:r>
     </w:p>
     <w:p>
@@ -338,58 +372,75 @@
           <w:sz w:val="21"/>
           <w:szCs w:val="21"/>
         </w:rPr>
-        <w:t xml:space="preserve">Owned the core B2B SaaS platform end to end: self-service customer console, campaign creation and lead-list targeting, script builder, telephony, per-second billing, wallets, reporting and call analytics; prioritized by metrics and data.</w:t>
-      </w:r>
-    </w:p>
-    <w:p>
-      <w:pPr>
-        <w:pStyle w:val="ListParagraph"/>
-        <w:numPr>
-          <w:ilvl w:val="0"/>
-          <w:numId w:val="1"/>
-        </w:numPr>
-        <w:spacing w:after="60"/>
-      </w:pPr>
-      <w:r>
-        <w:rPr>
-          <w:sz w:val="21"/>
-          <w:szCs w:val="21"/>
-        </w:rPr>
-        <w:t xml:space="preserve">Launched a virtual PBX as a complementary product to raise customer retention.</w:t>
-      </w:r>
-    </w:p>
-    <w:p>
-      <w:pPr>
-        <w:pStyle w:val="ListParagraph"/>
-        <w:numPr>
-          <w:ilvl w:val="0"/>
-          <w:numId w:val="1"/>
-        </w:numPr>
-        <w:spacing w:after="60"/>
-      </w:pPr>
-      <w:r>
-        <w:rPr>
-          <w:sz w:val="21"/>
-          <w:szCs w:val="21"/>
-        </w:rPr>
-        <w:t xml:space="preserve">Set up discovery and delivery: customer interviews, hypotheses formulated and defended with metrics, A/B testing of call scripts, effect sizing before development, decomposition and PRDs, a release cycle run jointly with sales, support and engineering.</w:t>
-      </w:r>
-    </w:p>
-    <w:p>
-      <w:pPr>
-        <w:pStyle w:val="ListParagraph"/>
-        <w:numPr>
-          <w:ilvl w:val="0"/>
-          <w:numId w:val="1"/>
-        </w:numPr>
-        <w:spacing w:after="60"/>
-      </w:pPr>
-      <w:r>
-        <w:rPr>
-          <w:sz w:val="21"/>
-          <w:szCs w:val="21"/>
-        </w:rPr>
-        <w:t xml:space="preserve">Introduced LLM tooling and vibe coding across company workflows: built a voice bot MVP on the OpenAI Realtime API in 2 days and an internal analytics tool over the database in 4 days; work with Claude Code and Codex daily.</w:t>
+        <w:t xml:space="preserve">The core B2B SaaS platform end to end: self-service customer console, campaign creation and lead-list targeting, script builder, telephony, per-second billing, wallets, reporting and call analytics. Prioritization by metrics and data.</w:t>
+      </w:r>
+    </w:p>
+    <w:p>
+      <w:pPr>
+        <w:pStyle w:val="ListParagraph"/>
+        <w:numPr>
+          <w:ilvl w:val="0"/>
+          <w:numId w:val="1"/>
+        </w:numPr>
+        <w:spacing w:after="60"/>
+      </w:pPr>
+      <w:r>
+        <w:rPr>
+          <w:sz w:val="21"/>
+          <w:szCs w:val="21"/>
+        </w:rPr>
+        <w:t xml:space="preserve">130+ countries, bulk calls and SMS: ran the group CPaaS products, Effebot (Zvonobot's international brand) and P1SMS. Traffic routing across providers, billing, API integrations.</w:t>
+      </w:r>
+    </w:p>
+    <w:p>
+      <w:pPr>
+        <w:pStyle w:val="ListParagraph"/>
+        <w:numPr>
+          <w:ilvl w:val="0"/>
+          <w:numId w:val="1"/>
+        </w:numPr>
+        <w:spacing w:after="60"/>
+      </w:pPr>
+      <w:r>
+        <w:rPr>
+          <w:sz w:val="21"/>
+          <w:szCs w:val="21"/>
+        </w:rPr>
+        <w:t xml:space="preserve">A virtual PBX launched as a complementary product to raise customer retention.</w:t>
+      </w:r>
+    </w:p>
+    <w:p>
+      <w:pPr>
+        <w:pStyle w:val="ListParagraph"/>
+        <w:numPr>
+          <w:ilvl w:val="0"/>
+          <w:numId w:val="1"/>
+        </w:numPr>
+        <w:spacing w:after="60"/>
+      </w:pPr>
+      <w:r>
+        <w:rPr>
+          <w:sz w:val="21"/>
+          <w:szCs w:val="21"/>
+        </w:rPr>
+        <w:t xml:space="preserve">A full discovery and delivery loop: customer interviews, hypotheses formulated and defended with metrics, A/B testing of call scripts, effect sizing before development, decomposition and PRDs, a cross-functional release cycle run jointly with sales, support and engineering.</w:t>
+      </w:r>
+    </w:p>
+    <w:p>
+      <w:pPr>
+        <w:pStyle w:val="ListParagraph"/>
+        <w:numPr>
+          <w:ilvl w:val="0"/>
+          <w:numId w:val="1"/>
+        </w:numPr>
+        <w:spacing w:after="60"/>
+      </w:pPr>
+      <w:r>
+        <w:rPr>
+          <w:sz w:val="21"/>
+          <w:szCs w:val="21"/>
+        </w:rPr>
+        <w:t xml:space="preserve">A voice bot MVP on the OpenAI Realtime API in 2 days and an internal analytics tool over the database in 4 days: brought LLM tooling and AI-assisted prototyping into company workflows. Work with Claude Code and Codex daily.</w:t>
       </w:r>
     </w:p>
     <w:p>
@@ -420,7 +471,7 @@
           <w:sz w:val="21"/>
           <w:szCs w:val="21"/>
         </w:rPr>
-        <w:t xml:space="preserve">Shipped a web product for the EU market: a self-service web account, Spanish localization, reporting and compliance features, usability testing with users.</w:t>
+        <w:t xml:space="preserve">A web product for the EU market: a self-service web account, Spanish localization, reporting and compliance features, usability testing.</w:t>
       </w:r>
     </w:p>
     <w:p>
@@ -452,58 +503,41 @@
           <w:sz w:val="21"/>
           <w:szCs w:val="21"/>
         </w:rPr>
-        <w:t xml:space="preserve">Zvonobot AI - A B2B voice AI agent platform: agent builder, campaigns, telephony, per-second billing. Proves a line taken from zero to 80 paying customers in under a year. Case study: https://rebsem.ru/projects/zvonobot-ai-en/</w:t>
-      </w:r>
-    </w:p>
-    <w:p>
-      <w:pPr>
-        <w:pStyle w:val="ListParagraph"/>
-        <w:numPr>
-          <w:ilvl w:val="0"/>
-          <w:numId w:val="1"/>
-        </w:numPr>
-        <w:spacing w:after="60"/>
-      </w:pPr>
-      <w:r>
-        <w:rPr>
-          <w:sz w:val="21"/>
-          <w:szCs w:val="21"/>
-        </w:rPr>
-        <w:t xml:space="preserve">cursivo - An AI CRM for car rental, live in production: reads client documents, scores deal risk, suggests the next step. Proves I take a product to live users outside the day job. Case study: https://rebsem.ru/projects/cursivo-en/ · https://cursivo.xyz</w:t>
-      </w:r>
-    </w:p>
-    <w:p>
-      <w:pPr>
-        <w:pStyle w:val="ListParagraph"/>
-        <w:numPr>
-          <w:ilvl w:val="0"/>
-          <w:numId w:val="1"/>
-        </w:numPr>
-        <w:spacing w:after="60"/>
-      </w:pPr>
-      <w:r>
-        <w:rPr>
-          <w:sz w:val="21"/>
-          <w:szCs w:val="21"/>
-        </w:rPr>
-        <w:t xml:space="preserve">obrabot - An internal voice AI analytics console: an LLM segments calls and surfaces what needs human attention. Proves LLM analytics built on top of real production data. Case study: https://rebsem.ru/projects/obrabot-en/</w:t>
-      </w:r>
-    </w:p>
-    <w:p>
-      <w:pPr>
-        <w:pStyle w:val="ListParagraph"/>
-        <w:numPr>
-          <w:ilvl w:val="0"/>
-          <w:numId w:val="1"/>
-        </w:numPr>
-        <w:spacing w:after="60"/>
-      </w:pPr>
-      <w:r>
-        <w:rPr>
-          <w:sz w:val="21"/>
-          <w:szCs w:val="21"/>
-        </w:rPr>
-        <w:t xml:space="preserve">pet projects - Side projects built personally with AI coding agents (Claude Code, Codex) in 1-7 days from idea to a working release. Proves hypothesis-validation speed and a shared language with engineers. https://github.com/RebSem</w:t>
+        <w:t xml:space="preserve">Zvonobot AI: 80 customers, 500,000+ minutes. A B2B voice AI agent platform: agent builder, campaigns, telephony, per-second billing. Proves a new line launched from zero to a visible share of group revenue in a year. Case study: https://rebsem.ru/projects/zvonobot-ai-en/ · https://zvonobot.ru/ai-agent</w:t>
+      </w:r>
+    </w:p>
+    <w:p>
+      <w:pPr>
+        <w:pStyle w:val="ListParagraph"/>
+        <w:numPr>
+          <w:ilvl w:val="0"/>
+          <w:numId w:val="1"/>
+        </w:numPr>
+        <w:spacing w:after="60"/>
+      </w:pPr>
+      <w:r>
+        <w:rPr>
+          <w:sz w:val="21"/>
+          <w:szCs w:val="21"/>
+        </w:rPr>
+        <w:t xml:space="preserve">cursivo: In development. An AI CRM for car rental: reads client documents, scores deal risk, suggests the next step. My own product, from idea to a working system, outside the day job. Case study: https://rebsem.ru/projects/cursivo-en/ · https://cursivo.xyz</w:t>
+      </w:r>
+    </w:p>
+    <w:p>
+      <w:pPr>
+        <w:pStyle w:val="ListParagraph"/>
+        <w:numPr>
+          <w:ilvl w:val="0"/>
+          <w:numId w:val="1"/>
+        </w:numPr>
+        <w:spacing w:after="60"/>
+      </w:pPr>
+      <w:r>
+        <w:rPr>
+          <w:sz w:val="21"/>
+          <w:szCs w:val="21"/>
+        </w:rPr>
+        <w:t xml:space="preserve">obrabot: Live in production, internal Prof-IT tool. An internal voice AI analytics console: an LLM segments calls and surfaces what needs human attention. LLM analytics built on top of real production data. Case study: https://rebsem.ru/projects/obrabot-en/</w:t>
       </w:r>
     </w:p>
     <w:p>
@@ -560,7 +594,7 @@
           <w:sz w:val="21"/>
           <w:szCs w:val="21"/>
         </w:rPr>
-        <w:t xml:space="preserve">product strategy and roadmap, discovery, customer interviews, metrics and product analytics, unit economics (LTV, CAC, retention, average spend), pricing, A/B experiments, hypothesis validation, go-to-market, OKRs, B2B SaaS, CRM</w:t>
+        <w:t xml:space="preserve">product strategy and roadmap, discovery, customer interviews, metrics and product analytics, unit economics (LTV, CAC, retention and churn, average spend), pricing and monetization, A/B experiments, hypothesis validation, go-to-market, OKRs, stakeholder management, B2B SaaS, CRM</w:t>
       </w:r>
     </w:p>
     <w:p>
@@ -581,7 +615,7 @@
           <w:sz w:val="21"/>
           <w:szCs w:val="21"/>
         </w:rPr>
-        <w:t xml:space="preserve">voice AI agents, conversational AI, LLM orchestration, prompt engineering, RAG, LLM evals, ASR, TTS, contact centers, SIP telephony, AI tools in daily work</w:t>
+        <w:t xml:space="preserve">generative AI (GenAI), voice AI agents, conversational AI, LLM orchestration, prompt engineering, RAG, LLM evals, ASR, TTS, contact centers, SIP telephony</w:t>
       </w:r>
     </w:p>
     <w:p>
@@ -602,7 +636,7 @@
           <w:sz w:val="21"/>
           <w:szCs w:val="21"/>
         </w:rPr>
-        <w:t xml:space="preserve">PRDs and specs, decomposition, spec, review, release cycle, working with engineers and sales, prototyping with AI coding agents (Claude Code, Codex), fast hypothesis validation, 0 to 1</w:t>
+        <w:t xml:space="preserve">PRDs and specs, decomposition, acceptance criteria, reviews, release cycle, working with engineers and sales, fast hypothesis validation, 0 to 1</w:t>
       </w:r>
     </w:p>
     <w:p>
@@ -637,6 +671,27 @@
           <w:sz w:val="21"/>
           <w:szCs w:val="21"/>
         </w:rPr>
+        <w:t xml:space="preserve">AI tools: </w:t>
+      </w:r>
+      <w:r>
+        <w:rPr>
+          <w:sz w:val="21"/>
+          <w:szCs w:val="21"/>
+        </w:rPr>
+        <w:t xml:space="preserve">Claude Code, Codex, prototyping with AI agents</w:t>
+      </w:r>
+    </w:p>
+    <w:p>
+      <w:pPr>
+        <w:spacing w:after="60"/>
+      </w:pPr>
+      <w:r>
+        <w:rPr>
+          <w:b/>
+          <w:bCs/>
+          <w:sz w:val="21"/>
+          <w:szCs w:val="21"/>
+        </w:rPr>
         <w:t xml:space="preserve">Technical: </w:t>
       </w:r>
       <w:r>
@@ -644,7 +699,7 @@
           <w:sz w:val="21"/>
           <w:szCs w:val="21"/>
         </w:rPr>
-        <w:t xml:space="preserve">SQL, Python, TypeScript, REST, integrations, telephony</w:t>
+        <w:t xml:space="preserve">SQL, Python, TypeScript, REST, integrations, telephony (SIP)</w:t>
       </w:r>
     </w:p>
     <w:p>
@@ -659,6 +714,33 @@
           <w:sz w:val="24"/>
           <w:szCs w:val="24"/>
         </w:rPr>
+        <w:t xml:space="preserve">WHAT I AM LOOKING FOR</w:t>
+      </w:r>
+    </w:p>
+    <w:p>
+      <w:pPr>
+        <w:spacing w:after="80"/>
+      </w:pPr>
+      <w:r>
+        <w:rPr>
+          <w:sz w:val="21"/>
+          <w:szCs w:val="21"/>
+        </w:rPr>
+        <w:t xml:space="preserve">A Product Manager or Product Owner role on a product team. Domains where my experience works from day one: B2B SaaS, AI and LLM products, payments and billing, telecom and CPaaS, infrastructure platforms with integrations and APIs. I am at my best where a product needs to be launched from zero or taken from MVP to growth.</w:t>
+      </w:r>
+    </w:p>
+    <w:p>
+      <w:pPr>
+        <w:pStyle w:val="Heading2"/>
+        <w:spacing w:after="100" w:before="260"/>
+      </w:pPr>
+      <w:r>
+        <w:rPr>
+          <w:b/>
+          <w:bCs/>
+          <w:sz w:val="24"/>
+          <w:szCs w:val="24"/>
+        </w:rPr>
         <w:t xml:space="preserve">EDUCATION, LANGUAGES, FORMAT</w:t>
       </w:r>
     </w:p>
@@ -701,7 +783,7 @@
           <w:sz w:val="21"/>
           <w:szCs w:val="21"/>
         </w:rPr>
-        <w:t xml:space="preserve">Russian: native. English: working proficiency, daily written use, comfortable on work calls.</w:t>
+        <w:t xml:space="preserve">Russian: native. English: B1+, working correspondence and documentation daily, confident on work calls.</w:t>
       </w:r>
     </w:p>
     <w:p>

</xml_diff>

<commit_message>
content: English B2 and USD/EUR/USDT invoicing on the CV
Mikhail stated B2 on 14 Sep 2026; the CV still said B1+ in six places,
and nothing said how a foreign company can pay a contractor in Russia,
which is the first question a currency-paying recruiter asks.

Co-Authored-By: Claude Opus 5.5 <noreply@anthropic.com>
</commit_message>
<xml_diff>
--- a/public/cv/Mikhail_Semenov_CV_EN.docx
+++ b/public/cv/Mikhail_Semenov_CV_EN.docx
@@ -783,7 +783,7 @@
           <w:sz w:val="21"/>
           <w:szCs w:val="21"/>
         </w:rPr>
-        <w:t xml:space="preserve">Russian: native. English: B1+, working correspondence and documentation daily, confident on work calls.</w:t>
+        <w:t xml:space="preserve">Russian: native. English: B2, working correspondence and documentation daily, confident on work calls.</w:t>
       </w:r>
     </w:p>
     <w:p>
@@ -804,7 +804,7 @@
           <w:sz w:val="21"/>
           <w:szCs w:val="21"/>
         </w:rPr>
-        <w:t xml:space="preserve">Remote from Perm (GMT+5), open to relocation (Cyprus, EU, UAE), available for business travel. Full-time or contract (self-employed), can start within 2-4 weeks.</w:t>
+        <w:t xml:space="preserve">Remote from Perm (GMT+5), open to relocation (Cyprus, EU, UAE), available for business travel. Full-time or contract (self-employed), invoices in USD, EUR or USDT, can start within 2-4 weeks.</w:t>
       </w:r>
     </w:p>
     <w:p>

</xml_diff>

<commit_message>
content: CV says English B2, invoicing in USD/EUR/USDT, ИП или самозанятость (#55)
* content: English B2 and USD/EUR/USDT invoicing on the CV

Mikhail stated B2 on 14 Sep 2026; the CV still said B1+ in six places,
and nothing said how a foreign company can pay a contractor in Russia,
which is the first question a currency-paying recruiter asks.

Co-Authored-By: Claude Opus 5.5 <noreply@anthropic.com>

* content: contract via sole proprietorship or self-employment on the RU CV

Owner confirmed 23.09 that both forms work for him. The EN wording
"self-employed" already covers both, so only the RU text changes.

Co-Authored-By: Claude Opus 5.5 <noreply@anthropic.com>

---------

Co-authored-by: Claude Opus 5.5 <noreply@anthropic.com>
</commit_message>
<xml_diff>
--- a/public/cv/Mikhail_Semenov_CV_EN.docx
+++ b/public/cv/Mikhail_Semenov_CV_EN.docx
@@ -783,7 +783,7 @@
           <w:sz w:val="21"/>
           <w:szCs w:val="21"/>
         </w:rPr>
-        <w:t xml:space="preserve">Russian: native. English: B1+, working correspondence and documentation daily, confident on work calls.</w:t>
+        <w:t xml:space="preserve">Russian: native. English: B2, working correspondence and documentation daily, confident on work calls.</w:t>
       </w:r>
     </w:p>
     <w:p>
@@ -804,7 +804,7 @@
           <w:sz w:val="21"/>
           <w:szCs w:val="21"/>
         </w:rPr>
-        <w:t xml:space="preserve">Remote from Perm (GMT+5), open to relocation (Cyprus, EU, UAE), available for business travel. Full-time or contract (self-employed), can start within 2-4 weeks.</w:t>
+        <w:t xml:space="preserve">Remote from Perm (GMT+5), open to relocation (Cyprus, EU, UAE), available for business travel. Full-time or contract (self-employed), invoices in USD, EUR or USDT, can start within 2-4 weeks.</w:t>
       </w:r>
     </w:p>
     <w:p>

</xml_diff>